<commit_message>
RecordingIsPosted ready for staging.
</commit_message>
<xml_diff>
--- a/CUWebinars.Web/App_Data/mergeTemplates/ConnectionInfo.docx
+++ b/CUWebinars.Web/App_Data/mergeTemplates/ConnectionInfo.docx
@@ -41,7 +41,32 @@
                 <w:b/>
                 <w:color w:val="FFFFFF" w:themeColor="background1"/>
               </w:rPr>
-              <w:t>Your Recording Is Posted!</w:t>
+              <w:t xml:space="preserve">Your </w:t>
+            </w:r>
+            <w:del w:id="0" w:author="Steve Hueners" w:date="2017-02-01T18:58:00Z">
+              <w:r>
+                <w:rPr>
+                  <w:b/>
+                  <w:color w:val="FFFFFF" w:themeColor="background1"/>
+                </w:rPr>
+                <w:delText>Recording Is Posted</w:delText>
+              </w:r>
+            </w:del>
+            <w:ins w:id="1" w:author="Steve Hueners" w:date="2017-02-01T18:58:00Z">
+              <w:r>
+                <w:rPr>
+                  <w:b/>
+                  <w:color w:val="FFFFFF" w:themeColor="background1"/>
+                </w:rPr>
+                <w:t>Conection Checklest</w:t>
+              </w:r>
+            </w:ins>
+            <w:r>
+              <w:rPr>
+                <w:b/>
+                <w:color w:val="FFFFFF" w:themeColor="background1"/>
+              </w:rPr>
+              <w:t>!</w:t>
             </w:r>
           </w:p>
         </w:tc>
@@ -77,7 +102,7 @@
                 <w:noProof/>
               </w:rPr>
               <w:drawing>
-                <wp:inline distT="0" distB="0" distL="0" distR="0">
+                <wp:inline distT="0" distB="0" distL="0" distR="0" wp14:anchorId="10C1664E" wp14:editId="667E6645">
                   <wp:extent cx="2400508" cy="762066"/>
                   <wp:effectExtent l="0" t="0" r="0" b="0"/>
                   <wp:docPr id="1" name="Picture 1"/>
@@ -92,7 +117,7 @@
                           <pic:cNvPicPr/>
                         </pic:nvPicPr>
                         <pic:blipFill>
-                          <a:blip r:embed="rId5">
+                          <a:blip r:embed="rId8">
                             <a:extLst>
                               <a:ext uri="{28A0092B-C50C-407E-A947-70E740481C1C}">
                                 <a14:useLocalDpi xmlns:a14="http://schemas.microsoft.com/office/drawing/2010/main" val="0"/>
@@ -328,27 +353,14 @@
             <w:r>
               <w:t xml:space="preserve">Dear </w:t>
             </w:r>
-            <w:r>
-              <w:fldChar w:fldCharType="begin"/>
-            </w:r>
-            <w:r>
-              <w:instrText xml:space="preserve"> MERGEFIELD  FirstName  \* MERGEFORMAT </w:instrText>
-            </w:r>
-            <w:r>
-              <w:fldChar w:fldCharType="separate"/>
-            </w:r>
-            <w:r>
-              <w:rPr>
-                <w:noProof/>
-              </w:rPr>
-              <w:t>«FirstName»</w:t>
-            </w:r>
-            <w:r>
-              <w:rPr>
-                <w:noProof/>
-              </w:rPr>
-              <w:fldChar w:fldCharType="end"/>
-            </w:r>
+            <w:fldSimple w:instr=" MERGEFIELD  FirstName  \* MERGEFORMAT ">
+              <w:r>
+                <w:rPr>
+                  <w:noProof/>
+                </w:rPr>
+                <w:t>«FirstName»</w:t>
+              </w:r>
+            </w:fldSimple>
             <w:r>
               <w:t>,</w:t>
             </w:r>
@@ -358,6 +370,11 @@
             <w:r>
               <w:t>It’s time to get ready for</w:t>
             </w:r>
+            <w:ins w:id="2" w:author="Kyle Bennett" w:date="2017-02-01T09:32:00Z">
+              <w:r>
+                <w:t xml:space="preserve"> the</w:t>
+              </w:r>
+            </w:ins>
             <w:r>
               <w:t xml:space="preserve"> </w:t>
             </w:r>
@@ -392,33 +409,31 @@
               </w:rPr>
               <w:fldChar w:fldCharType="end"/>
             </w:r>
+            <w:ins w:id="3" w:author="Kyle Bennett" w:date="2017-02-01T09:32:00Z">
+              <w:r>
+                <w:rPr>
+                  <w:i/>
+                </w:rPr>
+                <w:t xml:space="preserve"> </w:t>
+              </w:r>
+              <w:r>
+                <w:t>webinar</w:t>
+              </w:r>
+            </w:ins>
             <w:r>
               <w:t>.</w:t>
             </w:r>
             <w:r>
               <w:t xml:space="preserve"> </w:t>
             </w:r>
-            <w:r>
-              <w:fldChar w:fldCharType="begin"/>
-            </w:r>
-            <w:r>
-              <w:instrText xml:space="preserve"> MERGEFIELD  RegDesc  \* MERGEFORMAT </w:instrText>
-            </w:r>
-            <w:r>
-              <w:fldChar w:fldCharType="separate"/>
-            </w:r>
-            <w:r>
-              <w:rPr>
-                <w:noProof/>
-              </w:rPr>
-              <w:t>«RegDesc»</w:t>
-            </w:r>
-            <w:r>
-              <w:rPr>
-                <w:noProof/>
-              </w:rPr>
-              <w:fldChar w:fldCharType="end"/>
-            </w:r>
+            <w:fldSimple w:instr=" MERGEFIELD  RegDesc  \* MERGEFORMAT ">
+              <w:r>
+                <w:rPr>
+                  <w:noProof/>
+                </w:rPr>
+                <w:t>«RegDesc»</w:t>
+              </w:r>
+            </w:fldSimple>
             <w:r>
               <w:t xml:space="preserve"> </w:t>
             </w:r>
@@ -449,39 +464,86 @@
                 <w:b/>
                 <w:i/>
               </w:rPr>
-              <w:t>attending alone or</w:t>
-            </w:r>
+              <w:t>attending al</w:t>
+            </w:r>
+            <w:bookmarkStart w:id="4" w:name="_GoBack"/>
+            <w:bookmarkEnd w:id="4"/>
             <w:r>
               <w:rPr>
                 <w:b/>
                 <w:i/>
               </w:rPr>
-              <w:t xml:space="preserve"> with</w:t>
+              <w:t>one or</w:t>
             </w:r>
             <w:r>
               <w:rPr>
                 <w:b/>
                 <w:i/>
               </w:rPr>
-              <w:t xml:space="preserve"> just a couple other co-workers</w:t>
-            </w:r>
-            <w:r>
-              <w:t xml:space="preserve"> – </w:t>
-            </w:r>
-            <w:r>
-              <w:t>everything you need can be found at this link:</w:t>
-            </w:r>
-            <w:r>
+              <w:t xml:space="preserve"> with</w:t>
+            </w:r>
+            <w:r>
+              <w:rPr>
+                <w:b/>
+                <w:i/>
+              </w:rPr>
               <w:t xml:space="preserve"> </w:t>
             </w:r>
-            <w:fldSimple w:instr=" MERGEFIELD  ClickToJoinLink  \* MERGEFORMAT ">
+            <w:del w:id="5" w:author="Kyle Bennett" w:date="2017-02-01T09:34:00Z">
               <w:r>
                 <w:rPr>
-                  <w:noProof/>
+                  <w:b/>
+                  <w:i/>
                 </w:rPr>
-                <w:t>«ClickToJoinLink»</w:t>
+                <w:delText xml:space="preserve">just a couple other </w:delText>
               </w:r>
-            </w:fldSimple>
+            </w:del>
+            <w:r>
+              <w:rPr>
+                <w:b/>
+                <w:i/>
+              </w:rPr>
+              <w:t>co-workers</w:t>
+            </w:r>
+            <w:ins w:id="6" w:author="Kyle Bennett" w:date="2017-02-01T09:34:00Z">
+              <w:r>
+                <w:rPr>
+                  <w:b/>
+                  <w:i/>
+                </w:rPr>
+                <w:t xml:space="preserve"> at one location</w:t>
+              </w:r>
+            </w:ins>
+            <w:r>
+              <w:t xml:space="preserve"> – </w:t>
+            </w:r>
+            <w:r>
+              <w:t>everything you need can be found at this link:</w:t>
+            </w:r>
+            <w:r>
+              <w:t xml:space="preserve"> </w:t>
+            </w:r>
+            <w:r>
+              <w:fldChar w:fldCharType="begin"/>
+            </w:r>
+            <w:r>
+              <w:instrText xml:space="preserve"> MERGEFIELD  ClickToJoinLink  \* MERGEFORMAT </w:instrText>
+            </w:r>
+            <w:r>
+              <w:fldChar w:fldCharType="separate"/>
+            </w:r>
+            <w:r>
+              <w:rPr>
+                <w:noProof/>
+              </w:rPr>
+              <w:t>«ClickToJoinLink»</w:t>
+            </w:r>
+            <w:r>
+              <w:rPr>
+                <w:noProof/>
+              </w:rPr>
+              <w:fldChar w:fldCharType="end"/>
+            </w:r>
           </w:p>
           <w:p/>
           <w:p>
@@ -499,17 +561,52 @@
               <w:t xml:space="preserve"> </w:t>
             </w:r>
             <w:r>
-              <w:t>you can share connection information via email</w:t>
+              <w:t xml:space="preserve">you can share connection information </w:t>
+            </w:r>
+            <w:del w:id="7" w:author="Kyle Bennett" w:date="2017-02-01T09:35:00Z">
+              <w:r>
+                <w:delText xml:space="preserve">via </w:delText>
+              </w:r>
+            </w:del>
+            <w:ins w:id="8" w:author="Kyle Bennett" w:date="2017-02-01T09:35:00Z">
+              <w:r>
+                <w:t xml:space="preserve">by forwarding this </w:t>
+              </w:r>
+            </w:ins>
+            <w:r>
+              <w:t>email</w:t>
             </w:r>
             <w:r>
               <w:t xml:space="preserve">. </w:t>
             </w:r>
-            <w:r>
-              <w:t>Check here to enter their email</w:t>
-            </w:r>
-            <w:r>
-              <w:t>.</w:t>
-            </w:r>
+            <w:del w:id="9" w:author="Kyle Bennett" w:date="2017-02-01T09:35:00Z">
+              <w:r>
+                <w:delText>Check here to enter their email</w:delText>
+              </w:r>
+              <w:r>
+                <w:delText>.</w:delText>
+              </w:r>
+            </w:del>
+            <w:ins w:id="10" w:author="Kyle Bennett" w:date="2017-02-01T09:35:00Z">
+              <w:r>
+                <w:t xml:space="preserve"> Please be aware that each additional connection </w:t>
+              </w:r>
+            </w:ins>
+            <w:ins w:id="11" w:author="Kyle Bennett" w:date="2017-02-01T09:38:00Z">
+              <w:r>
+                <w:t>to the live</w:t>
+              </w:r>
+            </w:ins>
+            <w:ins w:id="12" w:author="Kyle Bennett" w:date="2017-02-01T09:35:00Z">
+              <w:r>
+                <w:t xml:space="preserve"> webinar is &lt;&lt;Add</w:t>
+              </w:r>
+            </w:ins>
+            <w:ins w:id="13" w:author="Kyle Bennett" w:date="2017-02-01T09:36:00Z">
+              <w:r>
+                <w:t>lLocCost&gt;&gt;.</w:t>
+              </w:r>
+            </w:ins>
           </w:p>
           <w:p>
             <w:pPr>
@@ -546,21 +643,38 @@
                 <w:b/>
                 <w:i/>
               </w:rPr>
-              <w:t xml:space="preserve">as Central Daylight Savings. </w:t>
+              <w:t xml:space="preserve">as Central </w:t>
+            </w:r>
+            <w:del w:id="14" w:author="Kyle Bennett" w:date="2017-02-01T09:36:00Z">
+              <w:r>
+                <w:rPr>
+                  <w:b/>
+                  <w:i/>
+                </w:rPr>
+                <w:delText>Daylight Savings</w:delText>
+              </w:r>
+            </w:del>
+            <w:ins w:id="15" w:author="Kyle Bennett" w:date="2017-02-01T09:36:00Z">
+              <w:r>
+                <w:rPr>
+                  <w:b/>
+                  <w:i/>
+                </w:rPr>
+                <w:t>Time</w:t>
+              </w:r>
+            </w:ins>
+            <w:r>
+              <w:rPr>
+                <w:b/>
+                <w:i/>
+              </w:rPr>
+              <w:t xml:space="preserve">. </w:t>
             </w:r>
             <w:r>
               <w:t>If</w:t>
             </w:r>
             <w:r>
-              <w:t xml:space="preserve"> you want a different </w:t>
-            </w:r>
-            <w:proofErr w:type="spellStart"/>
-            <w:r>
-              <w:t>timezone</w:t>
-            </w:r>
-            <w:proofErr w:type="spellEnd"/>
-            <w:r>
-              <w:t xml:space="preserve"> please indicate here.</w:t>
+              <w:t xml:space="preserve"> you want a different timezone please indicate here.</w:t>
             </w:r>
             <w:r>
               <w:t xml:space="preserve"> </w:t>
@@ -584,6 +698,7 @@
                   <w:listItem w:displayText="Alaska/Hawaii" w:value="-10"/>
                 </w:dropDownList>
               </w:sdtPr>
+              <w:sdtEndPr/>
               <w:sdtContent>
                 <w:r>
                   <w:rPr>
@@ -608,30 +723,7 @@
                 <w:b/>
                 <w:i/>
               </w:rPr>
-              <w:t xml:space="preserve">Add a reminder to </w:t>
-            </w:r>
-            <w:proofErr w:type="spellStart"/>
-            <w:r>
-              <w:rPr>
-                <w:b/>
-                <w:i/>
-              </w:rPr>
-              <w:t>your</w:t>
-            </w:r>
-            <w:proofErr w:type="spellEnd"/>
-            <w:r>
-              <w:rPr>
-                <w:b/>
-                <w:i/>
-              </w:rPr>
-              <w:t xml:space="preserve"> calendar</w:t>
-            </w:r>
-            <w:r>
-              <w:rPr>
-                <w:b/>
-                <w:i/>
-              </w:rPr>
-              <w:t xml:space="preserve">. </w:t>
+              <w:t xml:space="preserve">Add a reminder to your calendar. </w:t>
             </w:r>
             <w:r>
               <w:t>This link to add reminder</w:t>
@@ -661,14 +753,7 @@
                 <w:b/>
                 <w:i/>
               </w:rPr>
-              <w:t>is not yet paid</w:t>
-            </w:r>
-            <w:r>
-              <w:rPr>
-                <w:b/>
-                <w:i/>
-              </w:rPr>
-              <w:t xml:space="preserve">. </w:t>
+              <w:t xml:space="preserve">is not yet paid. </w:t>
             </w:r>
             <w:r>
               <w:t>I</w:t>
@@ -680,7 +765,15 @@
               <w:t xml:space="preserve"> click</w:t>
             </w:r>
             <w:r>
-              <w:t xml:space="preserve"> now here. Is someone else in your organization responsible for payments? Enter their email here and we will </w:t>
+              <w:t xml:space="preserve"> </w:t>
+            </w:r>
+            <w:del w:id="16" w:author="Kyle Bennett" w:date="2017-02-01T09:37:00Z">
+              <w:r>
+                <w:delText xml:space="preserve">now </w:delText>
+              </w:r>
+            </w:del>
+            <w:r>
+              <w:t xml:space="preserve">here. Is someone else in your organization responsible for payments? Enter their email here and we will </w:t>
             </w:r>
             <w:r>
               <w:t>send the required information directly.</w:t>
@@ -692,32 +785,22 @@
             </w:pPr>
           </w:p>
           <w:p>
-            <w:bookmarkStart w:id="0" w:name="_GoBack"/>
-            <w:bookmarkEnd w:id="0"/>
+            <w:pPr>
+              <w:rPr>
+                <w:ins w:id="17" w:author="Kyle Bennett" w:date="2017-02-01T09:37:00Z"/>
+              </w:rPr>
+            </w:pPr>
             <w:r>
               <w:t xml:space="preserve">The customer service staff at </w:t>
             </w:r>
-            <w:r>
-              <w:fldChar w:fldCharType="begin"/>
-            </w:r>
-            <w:r>
-              <w:instrText xml:space="preserve"> MERGEFIELD  TenantName  \* MERGEFORMAT </w:instrText>
-            </w:r>
-            <w:r>
-              <w:fldChar w:fldCharType="separate"/>
-            </w:r>
-            <w:r>
-              <w:rPr>
-                <w:noProof/>
-              </w:rPr>
-              <w:t>«TenantName»</w:t>
-            </w:r>
-            <w:r>
-              <w:rPr>
-                <w:noProof/>
-              </w:rPr>
-              <w:fldChar w:fldCharType="end"/>
-            </w:r>
+            <w:fldSimple w:instr=" MERGEFIELD  TenantName  \* MERGEFORMAT ">
+              <w:r>
+                <w:rPr>
+                  <w:noProof/>
+                </w:rPr>
+                <w:t>«TenantName»</w:t>
+              </w:r>
+            </w:fldSimple>
             <w:r>
               <w:t xml:space="preserve"> is confident you’ll find both </w:t>
             </w:r>
@@ -733,33 +816,41 @@
             <w:r>
               <w:t xml:space="preserve"> meets the highest standards in the industry. And in the off chance it doesn’t, please visit our online chat where you’ll find a professional representative waiting to make sure your satisfaction is restored. </w:t>
             </w:r>
-            <w:r>
-              <w:fldChar w:fldCharType="begin"/>
-            </w:r>
-            <w:r>
-              <w:instrText xml:space="preserve"> MERGEFIELD  TechSupportLink  \* MERGEFO</w:instrText>
-            </w:r>
-            <w:r>
-              <w:instrText xml:space="preserve">RMAT </w:instrText>
-            </w:r>
-            <w:r>
-              <w:fldChar w:fldCharType="separate"/>
-            </w:r>
-            <w:r>
-              <w:rPr>
-                <w:noProof/>
-              </w:rPr>
-              <w:t>«TechSupportLink»</w:t>
-            </w:r>
-            <w:r>
-              <w:rPr>
-                <w:noProof/>
-              </w:rPr>
-              <w:fldChar w:fldCharType="end"/>
-            </w:r>
+            <w:fldSimple w:instr=" MERGEFIELD  TechSupportLink  \* MERGEFORMAT ">
+              <w:r>
+                <w:rPr>
+                  <w:noProof/>
+                </w:rPr>
+                <w:t>«TechSupportLink»</w:t>
+              </w:r>
+            </w:fldSimple>
             <w:r>
               <w:t>.</w:t>
             </w:r>
+          </w:p>
+          <w:p>
+            <w:pPr>
+              <w:rPr>
+                <w:ins w:id="18" w:author="Kyle Bennett" w:date="2017-02-01T09:37:00Z"/>
+              </w:rPr>
+            </w:pPr>
+          </w:p>
+          <w:p>
+            <w:ins w:id="19" w:author="Kyle Bennett" w:date="2017-02-01T09:38:00Z">
+              <w:r>
+                <w:t>(</w:t>
+              </w:r>
+            </w:ins>
+            <w:ins w:id="20" w:author="Kyle Bennett" w:date="2017-02-01T09:37:00Z">
+              <w:r>
+                <w:t>Display contact information in footer.</w:t>
+              </w:r>
+            </w:ins>
+            <w:ins w:id="21" w:author="Kyle Bennett" w:date="2017-02-01T09:38:00Z">
+              <w:r>
+                <w:t>)</w:t>
+              </w:r>
+            </w:ins>
           </w:p>
           <w:p/>
         </w:tc>
@@ -819,6 +910,17 @@
     </w:sectPr>
   </w:body>
 </w:document>
+</file>
+
+<file path=word/people.xml><?xml version="1.0" encoding="utf-8"?>
+<w15:people xmlns:wpc="http://schemas.microsoft.com/office/word/2010/wordprocessingCanvas" xmlns:cx="http://schemas.microsoft.com/office/drawing/2014/chartex" xmlns:cx1="http://schemas.microsoft.com/office/drawing/2015/9/8/chartex" xmlns:cx2="http://schemas.microsoft.com/office/drawing/2015/10/21/chartex" xmlns:cx3="http://schemas.microsoft.com/office/drawing/2016/5/9/chartex" xmlns:cx4="http://schemas.microsoft.com/office/drawing/2016/5/10/chartex" xmlns:cx5="http://schemas.microsoft.com/office/drawing/2016/5/11/chartex" xmlns:mc="http://schemas.openxmlformats.org/markup-compatibility/2006" xmlns:o="urn:schemas-microsoft-com:office:office" xmlns:r="http://schemas.openxmlformats.org/officeDocument/2006/relationships" xmlns:m="http://schemas.openxmlformats.org/officeDocument/2006/math" xmlns:v="urn:schemas-microsoft-com:vml" xmlns:wp14="http://schemas.microsoft.com/office/word/2010/wordprocessingDrawing" xmlns:wp="http://schemas.openxmlformats.org/drawingml/2006/wordprocessingDrawing" xmlns:w10="urn:schemas-microsoft-com:office:word" xmlns:w="http://schemas.openxmlformats.org/wordprocessingml/2006/main" xmlns:w14="http://schemas.microsoft.com/office/word/2010/wordml" xmlns:w15="http://schemas.microsoft.com/office/word/2012/wordml" xmlns:w16se="http://schemas.microsoft.com/office/word/2015/wordml/symex" xmlns:wpg="http://schemas.microsoft.com/office/word/2010/wordprocessingGroup" xmlns:wpi="http://schemas.microsoft.com/office/word/2010/wordprocessingInk" xmlns:wne="http://schemas.microsoft.com/office/word/2006/wordml" xmlns:wps="http://schemas.microsoft.com/office/word/2010/wordprocessingShape" mc:Ignorable="w14 w15 w16se wp14">
+  <w15:person w15:author="Steve Hueners">
+    <w15:presenceInfo w15:providerId="Windows Live" w15:userId="3565f3327b9d7c45"/>
+  </w15:person>
+  <w15:person w15:author="Kyle Bennett">
+    <w15:presenceInfo w15:providerId="None" w15:userId="Kyle Bennett"/>
+  </w15:person>
+</w15:people>
 </file>
 
 <file path=word/styles.xml><?xml version="1.0" encoding="utf-8"?>
@@ -1387,6 +1489,7 @@
     <w:rsidRoot w:val="0087663C"/>
     <w:rsid w:val="000F3534"/>
     <w:rsid w:val="0087663C"/>
+    <w:rsid w:val="00E02DB5"/>
   </w:rsids>
   <m:mathPr>
     <m:mathFont m:val="Cambria Math"/>
@@ -2123,11 +2226,236 @@
 </file>
 
 <file path=customXml/item1.xml><?xml version="1.0" encoding="utf-8"?>
+<?mso-contentType ?>
+<FormTemplates xmlns="http://schemas.microsoft.com/sharepoint/v3/contenttype/forms">
+  <Display>DocumentLibraryForm</Display>
+  <Edit>DocumentLibraryForm</Edit>
+  <New>DocumentLibraryForm</New>
+</FormTemplates>
+</file>
+
+<file path=customXml/item2.xml><?xml version="1.0" encoding="utf-8"?>
+<p:properties xmlns:p="http://schemas.microsoft.com/office/2006/metadata/properties" xmlns:xsi="http://www.w3.org/2001/XMLSchema-instance" xmlns:pc="http://schemas.microsoft.com/office/infopath/2007/PartnerControls">
+  <documentManagement/>
+</p:properties>
+</file>
+
+<file path=customXml/item3.xml><?xml version="1.0" encoding="utf-8"?>
+<ct:contentTypeSchema xmlns:ct="http://schemas.microsoft.com/office/2006/metadata/contentType" xmlns:ma="http://schemas.microsoft.com/office/2006/metadata/properties/metaAttributes" ct:_="" ma:_="" ma:contentTypeName="Document" ma:contentTypeID="0x0101001F790F750B123C469E5BE2A9EB6D9D99" ma:contentTypeVersion="5" ma:contentTypeDescription="Create a new document." ma:contentTypeScope="" ma:versionID="d5506308d6bf7227f7ec554c4f76cef4">
+  <xsd:schema xmlns:xsd="http://www.w3.org/2001/XMLSchema" xmlns:xs="http://www.w3.org/2001/XMLSchema" xmlns:p="http://schemas.microsoft.com/office/2006/metadata/properties" xmlns:ns2="92e85379-ec43-4192-8d26-0c9c1113fbaf" targetNamespace="http://schemas.microsoft.com/office/2006/metadata/properties" ma:root="true" ma:fieldsID="eeae2fc0e0cc93f015230f549111e05d" ns2:_="">
+    <xsd:import namespace="92e85379-ec43-4192-8d26-0c9c1113fbaf"/>
+    <xsd:element name="properties">
+      <xsd:complexType>
+        <xsd:sequence>
+          <xsd:element name="documentManagement">
+            <xsd:complexType>
+              <xsd:all>
+                <xsd:element ref="ns2:SharedWithUsers" minOccurs="0"/>
+                <xsd:element ref="ns2:SharingHintHash" minOccurs="0"/>
+                <xsd:element ref="ns2:SharedWithDetails" minOccurs="0"/>
+                <xsd:element ref="ns2:LastSharedByUser" minOccurs="0"/>
+                <xsd:element ref="ns2:LastSharedByTime" minOccurs="0"/>
+              </xsd:all>
+            </xsd:complexType>
+          </xsd:element>
+        </xsd:sequence>
+      </xsd:complexType>
+    </xsd:element>
+  </xsd:schema>
+  <xsd:schema xmlns:xsd="http://www.w3.org/2001/XMLSchema" xmlns:xs="http://www.w3.org/2001/XMLSchema" xmlns:dms="http://schemas.microsoft.com/office/2006/documentManagement/types" xmlns:pc="http://schemas.microsoft.com/office/infopath/2007/PartnerControls" targetNamespace="92e85379-ec43-4192-8d26-0c9c1113fbaf" elementFormDefault="qualified">
+    <xsd:import namespace="http://schemas.microsoft.com/office/2006/documentManagement/types"/>
+    <xsd:import namespace="http://schemas.microsoft.com/office/infopath/2007/PartnerControls"/>
+    <xsd:element name="SharedWithUsers" ma:index="8" nillable="true" ma:displayName="Shared With" ma:internalName="SharedWithUsers" ma:readOnly="true">
+      <xsd:complexType>
+        <xsd:complexContent>
+          <xsd:extension base="dms:UserMulti">
+            <xsd:sequence>
+              <xsd:element name="UserInfo" minOccurs="0" maxOccurs="unbounded">
+                <xsd:complexType>
+                  <xsd:sequence>
+                    <xsd:element name="DisplayName" type="xsd:string" minOccurs="0"/>
+                    <xsd:element name="AccountId" type="dms:UserId" minOccurs="0" nillable="true"/>
+                    <xsd:element name="AccountType" type="xsd:string" minOccurs="0"/>
+                  </xsd:sequence>
+                </xsd:complexType>
+              </xsd:element>
+            </xsd:sequence>
+          </xsd:extension>
+        </xsd:complexContent>
+      </xsd:complexType>
+    </xsd:element>
+    <xsd:element name="SharingHintHash" ma:index="9" nillable="true" ma:displayName="Sharing Hint Hash" ma:internalName="SharingHintHash" ma:readOnly="true">
+      <xsd:simpleType>
+        <xsd:restriction base="dms:Text"/>
+      </xsd:simpleType>
+    </xsd:element>
+    <xsd:element name="SharedWithDetails" ma:index="10" nillable="true" ma:displayName="Shared With Details" ma:description="" ma:internalName="SharedWithDetails" ma:readOnly="true">
+      <xsd:simpleType>
+        <xsd:restriction base="dms:Note">
+          <xsd:maxLength value="255"/>
+        </xsd:restriction>
+      </xsd:simpleType>
+    </xsd:element>
+    <xsd:element name="LastSharedByUser" ma:index="11" nillable="true" ma:displayName="Last Shared By User" ma:description="" ma:internalName="LastSharedByUser" ma:readOnly="true">
+      <xsd:simpleType>
+        <xsd:restriction base="dms:Note">
+          <xsd:maxLength value="255"/>
+        </xsd:restriction>
+      </xsd:simpleType>
+    </xsd:element>
+    <xsd:element name="LastSharedByTime" ma:index="12" nillable="true" ma:displayName="Last Shared By Time" ma:description="" ma:internalName="LastSharedByTime" ma:readOnly="true">
+      <xsd:simpleType>
+        <xsd:restriction base="dms:DateTime"/>
+      </xsd:simpleType>
+    </xsd:element>
+  </xsd:schema>
+  <xsd:schema xmlns="http://schemas.openxmlformats.org/package/2006/metadata/core-properties" xmlns:xsd="http://www.w3.org/2001/XMLSchema" xmlns:xsi="http://www.w3.org/2001/XMLSchema-instance" xmlns:dc="http://purl.org/dc/elements/1.1/" xmlns:dcterms="http://purl.org/dc/terms/" xmlns:odoc="http://schemas.microsoft.com/internal/obd" targetNamespace="http://schemas.openxmlformats.org/package/2006/metadata/core-properties" elementFormDefault="qualified" attributeFormDefault="unqualified" blockDefault="#all">
+    <xsd:import namespace="http://purl.org/dc/elements/1.1/" schemaLocation="http://dublincore.org/schemas/xmls/qdc/2003/04/02/dc.xsd"/>
+    <xsd:import namespace="http://purl.org/dc/terms/" schemaLocation="http://dublincore.org/schemas/xmls/qdc/2003/04/02/dcterms.xsd"/>
+    <xsd:element name="coreProperties" type="CT_coreProperties"/>
+    <xsd:complexType name="CT_coreProperties">
+      <xsd:all>
+        <xsd:element ref="dc:creator" minOccurs="0" maxOccurs="1"/>
+        <xsd:element ref="dcterms:created" minOccurs="0" maxOccurs="1"/>
+        <xsd:element ref="dc:identifier" minOccurs="0" maxOccurs="1"/>
+        <xsd:element name="contentType" minOccurs="0" maxOccurs="1" type="xsd:string" ma:index="0" ma:displayName="Content Type"/>
+        <xsd:element ref="dc:title" minOccurs="0" maxOccurs="1" ma:index="4" ma:displayName="Title"/>
+        <xsd:element ref="dc:subject" minOccurs="0" maxOccurs="1"/>
+        <xsd:element ref="dc:description" minOccurs="0" maxOccurs="1"/>
+        <xsd:element name="keywords" minOccurs="0" maxOccurs="1" type="xsd:string"/>
+        <xsd:element ref="dc:language" minOccurs="0" maxOccurs="1"/>
+        <xsd:element name="category" minOccurs="0" maxOccurs="1" type="xsd:string"/>
+        <xsd:element name="version" minOccurs="0" maxOccurs="1" type="xsd:string"/>
+        <xsd:element name="revision" minOccurs="0" maxOccurs="1" type="xsd:string">
+          <xsd:annotation>
+            <xsd:documentation>
+                        This value indicates the number of saves or revisions. The application is responsible for updating this value after each revision.
+                    </xsd:documentation>
+          </xsd:annotation>
+        </xsd:element>
+        <xsd:element name="lastModifiedBy" minOccurs="0" maxOccurs="1" type="xsd:string"/>
+        <xsd:element ref="dcterms:modified" minOccurs="0" maxOccurs="1"/>
+        <xsd:element name="contentStatus" minOccurs="0" maxOccurs="1" type="xsd:string"/>
+      </xsd:all>
+    </xsd:complexType>
+  </xsd:schema>
+  <xs:schema xmlns:pc="http://schemas.microsoft.com/office/infopath/2007/PartnerControls" xmlns:xs="http://www.w3.org/2001/XMLSchema" targetNamespace="http://schemas.microsoft.com/office/infopath/2007/PartnerControls" elementFormDefault="qualified" attributeFormDefault="unqualified">
+    <xs:element name="Person">
+      <xs:complexType>
+        <xs:sequence>
+          <xs:element ref="pc:DisplayName" minOccurs="0"/>
+          <xs:element ref="pc:AccountId" minOccurs="0"/>
+          <xs:element ref="pc:AccountType" minOccurs="0"/>
+        </xs:sequence>
+      </xs:complexType>
+    </xs:element>
+    <xs:element name="DisplayName" type="xs:string"/>
+    <xs:element name="AccountId" type="xs:string"/>
+    <xs:element name="AccountType" type="xs:string"/>
+    <xs:element name="BDCAssociatedEntity">
+      <xs:complexType>
+        <xs:sequence>
+          <xs:element ref="pc:BDCEntity" minOccurs="0" maxOccurs="unbounded"/>
+        </xs:sequence>
+        <xs:attribute ref="pc:EntityNamespace"/>
+        <xs:attribute ref="pc:EntityName"/>
+        <xs:attribute ref="pc:SystemInstanceName"/>
+        <xs:attribute ref="pc:AssociationName"/>
+      </xs:complexType>
+    </xs:element>
+    <xs:attribute name="EntityNamespace" type="xs:string"/>
+    <xs:attribute name="EntityName" type="xs:string"/>
+    <xs:attribute name="SystemInstanceName" type="xs:string"/>
+    <xs:attribute name="AssociationName" type="xs:string"/>
+    <xs:element name="BDCEntity">
+      <xs:complexType>
+        <xs:sequence>
+          <xs:element ref="pc:EntityDisplayName" minOccurs="0"/>
+          <xs:element ref="pc:EntityInstanceReference" minOccurs="0"/>
+          <xs:element ref="pc:EntityId1" minOccurs="0"/>
+          <xs:element ref="pc:EntityId2" minOccurs="0"/>
+          <xs:element ref="pc:EntityId3" minOccurs="0"/>
+          <xs:element ref="pc:EntityId4" minOccurs="0"/>
+          <xs:element ref="pc:EntityId5" minOccurs="0"/>
+        </xs:sequence>
+      </xs:complexType>
+    </xs:element>
+    <xs:element name="EntityDisplayName" type="xs:string"/>
+    <xs:element name="EntityInstanceReference" type="xs:string"/>
+    <xs:element name="EntityId1" type="xs:string"/>
+    <xs:element name="EntityId2" type="xs:string"/>
+    <xs:element name="EntityId3" type="xs:string"/>
+    <xs:element name="EntityId4" type="xs:string"/>
+    <xs:element name="EntityId5" type="xs:string"/>
+    <xs:element name="Terms">
+      <xs:complexType>
+        <xs:sequence>
+          <xs:element ref="pc:TermInfo" minOccurs="0" maxOccurs="unbounded"/>
+        </xs:sequence>
+      </xs:complexType>
+    </xs:element>
+    <xs:element name="TermInfo">
+      <xs:complexType>
+        <xs:sequence>
+          <xs:element ref="pc:TermName" minOccurs="0"/>
+          <xs:element ref="pc:TermId" minOccurs="0"/>
+        </xs:sequence>
+      </xs:complexType>
+    </xs:element>
+    <xs:element name="TermName" type="xs:string"/>
+    <xs:element name="TermId" type="xs:string"/>
+  </xs:schema>
+</ct:contentTypeSchema>
+</file>
+
+<file path=customXml/item4.xml><?xml version="1.0" encoding="utf-8"?>
 <b:Sources xmlns:b="http://schemas.openxmlformats.org/officeDocument/2006/bibliography" xmlns="http://schemas.openxmlformats.org/officeDocument/2006/bibliography" SelectedStyle="\APASixthEditionOfficeOnline.xsl" StyleName="APA" Version="6"/>
 </file>
 
 <file path=customXml/itemProps1.xml><?xml version="1.0" encoding="utf-8"?>
-<ds:datastoreItem xmlns:ds="http://schemas.openxmlformats.org/officeDocument/2006/customXml" ds:itemID="{C3B4824F-4065-4BF7-9A25-B2F6262EC0FA}">
+<ds:datastoreItem xmlns:ds="http://schemas.openxmlformats.org/officeDocument/2006/customXml" ds:itemID="{58EA61EC-0C8F-4288-A744-070BCA9D8C37}">
+  <ds:schemaRefs>
+    <ds:schemaRef ds:uri="http://schemas.microsoft.com/sharepoint/v3/contenttype/forms"/>
+  </ds:schemaRefs>
+</ds:datastoreItem>
+</file>
+
+<file path=customXml/itemProps2.xml><?xml version="1.0" encoding="utf-8"?>
+<ds:datastoreItem xmlns:ds="http://schemas.openxmlformats.org/officeDocument/2006/customXml" ds:itemID="{380D3082-D376-4EBA-959B-E687D5014059}">
+  <ds:schemaRefs>
+    <ds:schemaRef ds:uri="http://schemas.microsoft.com/office/2006/documentManagement/types"/>
+    <ds:schemaRef ds:uri="http://schemas.openxmlformats.org/package/2006/metadata/core-properties"/>
+    <ds:schemaRef ds:uri="http://purl.org/dc/elements/1.1/"/>
+    <ds:schemaRef ds:uri="http://schemas.microsoft.com/office/2006/metadata/properties"/>
+    <ds:schemaRef ds:uri="http://schemas.microsoft.com/office/infopath/2007/PartnerControls"/>
+    <ds:schemaRef ds:uri="http://purl.org/dc/terms/"/>
+    <ds:schemaRef ds:uri="92e85379-ec43-4192-8d26-0c9c1113fbaf"/>
+    <ds:schemaRef ds:uri="http://www.w3.org/XML/1998/namespace"/>
+    <ds:schemaRef ds:uri="http://purl.org/dc/dcmitype/"/>
+  </ds:schemaRefs>
+</ds:datastoreItem>
+</file>
+
+<file path=customXml/itemProps3.xml><?xml version="1.0" encoding="utf-8"?>
+<ds:datastoreItem xmlns:ds="http://schemas.openxmlformats.org/officeDocument/2006/customXml" ds:itemID="{2F61D107-7875-4113-84FF-7BBF066630F1}">
+  <ds:schemaRefs>
+    <ds:schemaRef ds:uri="http://schemas.microsoft.com/office/2006/metadata/contentType"/>
+    <ds:schemaRef ds:uri="http://schemas.microsoft.com/office/2006/metadata/properties/metaAttributes"/>
+    <ds:schemaRef ds:uri="http://www.w3.org/2001/XMLSchema"/>
+    <ds:schemaRef ds:uri="http://schemas.microsoft.com/office/2006/metadata/properties"/>
+    <ds:schemaRef ds:uri="92e85379-ec43-4192-8d26-0c9c1113fbaf"/>
+    <ds:schemaRef ds:uri="http://schemas.microsoft.com/office/2006/documentManagement/types"/>
+    <ds:schemaRef ds:uri="http://schemas.microsoft.com/office/infopath/2007/PartnerControls"/>
+    <ds:schemaRef ds:uri="http://schemas.openxmlformats.org/package/2006/metadata/core-properties"/>
+    <ds:schemaRef ds:uri="http://purl.org/dc/elements/1.1/"/>
+    <ds:schemaRef ds:uri="http://purl.org/dc/terms/"/>
+    <ds:schemaRef ds:uri="http://schemas.microsoft.com/internal/obd"/>
+  </ds:schemaRefs>
+</ds:datastoreItem>
+</file>
+
+<file path=customXml/itemProps4.xml><?xml version="1.0" encoding="utf-8"?>
+<ds:datastoreItem xmlns:ds="http://schemas.openxmlformats.org/officeDocument/2006/customXml" ds:itemID="{CCCBAE3A-A006-4F6B-8F1F-0CC45108DA0F}">
   <ds:schemaRefs>
     <ds:schemaRef ds:uri="http://schemas.openxmlformats.org/officeDocument/2006/bibliography"/>
   </ds:schemaRefs>

</xml_diff>